<commit_message>
Fill in GitHub repo URL in submission docs
Code/Data Availability and cover letter now point to the actual repo
instead of the "upon acceptance" placeholder.
</commit_message>
<xml_diff>
--- a/submission/title_page.docx
+++ b/submission/title_page.docx
@@ -215,7 +215,7 @@
           <w:sz w:val="22"/>
           <w:szCs w:val="22"/>
         </w:rPr>
-        <w:t xml:space="preserve">The ASSISTments-2009 corrected dataset is publicly available at https://sites.google.com/site/assistmentsdata/. All preprocessing scripts, model implementations, and analysis code are released at [GitHub URL — author to add upon acceptance].</w:t>
+        <w:t>The ASSISTments-2009 corrected dataset is publicly available at https://sites.google.com/site/assistmentsdata/. All preprocessing scripts, model implementations, and analysis code are released at https://github.com/RifatIbnAlam/llm-kt-benchmark.</w:t>
       </w:r>
     </w:p>
     <w:p>
@@ -243,7 +243,7 @@
           <w:sz w:val="22"/>
           <w:szCs w:val="22"/>
         </w:rPr>
-        <w:t xml:space="preserve">All code (preprocessing, model implementations for BKT, DKT, SAKT, AKT, multi-provider LLM tracer, and statistical analysis) is released at [GitHub URL — author to add upon acceptance].</w:t>
+        <w:t>All code (preprocessing, model implementations for BKT, DKT, SAKT, AKT, multi-provider LLM tracer, and statistical analysis) is released at https://github.com/RifatIbnAlam/llm-kt-benchmark.</w:t>
       </w:r>
     </w:p>
     <w:p>

</xml_diff>